<commit_message>
Complete Assignment 17.1 Performing ETL Using NiFi
</commit_message>
<xml_diff>
--- a/Assignment/Required_Final_Assignment_17.1_Performing_ETL_Using_NiFi/Assignment_17.1_Submission.docx
+++ b/Assignment/Required_Final_Assignment_17.1_Performing_ETL_Using_NiFi/Assignment_17.1_Submission.docx
@@ -180,6 +180,9 @@
         <w:ind w:left="360"/>
       </w:pPr>
       <w:r>
+        <w:rPr>
+          <w:noProof/>
+        </w:rPr>
         <w:drawing>
           <wp:inline distT="0" distB="0" distL="0" distR="0" wp14:anchorId="484DFBF5" wp14:editId="244198C2">
             <wp:extent cx="5943600" cy="1369060"/>
@@ -317,6 +320,9 @@
         <w:ind w:left="360"/>
       </w:pPr>
       <w:r>
+        <w:rPr>
+          <w:noProof/>
+        </w:rPr>
         <w:drawing>
           <wp:inline distT="0" distB="0" distL="0" distR="0" wp14:anchorId="4182C8F8" wp14:editId="14886CDF">
             <wp:extent cx="5943600" cy="887095"/>
@@ -389,6 +395,9 @@
         <w:ind w:left="360"/>
       </w:pPr>
       <w:r>
+        <w:rPr>
+          <w:noProof/>
+        </w:rPr>
         <w:drawing>
           <wp:inline distT="0" distB="0" distL="0" distR="0" wp14:anchorId="3AC87CAA" wp14:editId="7541E122">
             <wp:extent cx="5943600" cy="941705"/>
@@ -506,6 +515,9 @@
         <w:ind w:left="360"/>
       </w:pPr>
       <w:r>
+        <w:rPr>
+          <w:noProof/>
+        </w:rPr>
         <w:drawing>
           <wp:inline distT="0" distB="0" distL="0" distR="0" wp14:anchorId="3A229F2F" wp14:editId="52328BBC">
             <wp:extent cx="4214191" cy="3013417"/>
@@ -715,6 +727,9 @@
         <w:ind w:left="360"/>
       </w:pPr>
       <w:r>
+        <w:rPr>
+          <w:noProof/>
+        </w:rPr>
         <w:drawing>
           <wp:inline distT="0" distB="0" distL="0" distR="0" wp14:anchorId="0DC5DBE7" wp14:editId="702306A8">
             <wp:extent cx="5080883" cy="2973077"/>
@@ -758,6 +773,9 @@
         <w:ind w:left="360"/>
       </w:pPr>
       <w:r>
+        <w:rPr>
+          <w:noProof/>
+        </w:rPr>
         <w:lastRenderedPageBreak/>
         <w:drawing>
           <wp:inline distT="0" distB="0" distL="0" distR="0" wp14:anchorId="4F997594" wp14:editId="3CD39CC8">
@@ -854,6 +872,9 @@
         <w:ind w:left="360"/>
       </w:pPr>
       <w:r>
+        <w:rPr>
+          <w:noProof/>
+        </w:rPr>
         <w:drawing>
           <wp:inline distT="0" distB="0" distL="0" distR="0" wp14:anchorId="03EE11B0" wp14:editId="280DDA4F">
             <wp:extent cx="4858247" cy="3399735"/>
@@ -897,6 +918,9 @@
         <w:ind w:left="360"/>
       </w:pPr>
       <w:r>
+        <w:rPr>
+          <w:noProof/>
+        </w:rPr>
         <w:lastRenderedPageBreak/>
         <w:drawing>
           <wp:inline distT="0" distB="0" distL="0" distR="0" wp14:anchorId="37E3B0FF" wp14:editId="2A2CE477">
@@ -1005,6 +1029,9 @@
         <w:ind w:left="360"/>
       </w:pPr>
       <w:r>
+        <w:rPr>
+          <w:noProof/>
+        </w:rPr>
         <w:drawing>
           <wp:inline distT="0" distB="0" distL="0" distR="0" wp14:anchorId="092AF8F7" wp14:editId="3E46E400">
             <wp:extent cx="5025176" cy="3562184"/>
@@ -1048,6 +1075,9 @@
         <w:ind w:left="360"/>
       </w:pPr>
       <w:r>
+        <w:rPr>
+          <w:noProof/>
+        </w:rPr>
         <w:lastRenderedPageBreak/>
         <w:drawing>
           <wp:inline distT="0" distB="0" distL="0" distR="0" wp14:anchorId="01B6B551" wp14:editId="0FE61044">
@@ -1092,6 +1122,9 @@
         <w:ind w:left="360"/>
       </w:pPr>
       <w:r>
+        <w:rPr>
+          <w:noProof/>
+        </w:rPr>
         <w:drawing>
           <wp:inline distT="0" distB="0" distL="0" distR="0" wp14:anchorId="598EBABF" wp14:editId="7FEA207B">
             <wp:extent cx="5009322" cy="3612492"/>
@@ -1203,6 +1236,9 @@
         <w:ind w:left="360"/>
       </w:pPr>
       <w:r>
+        <w:rPr>
+          <w:noProof/>
+        </w:rPr>
         <w:drawing>
           <wp:inline distT="0" distB="0" distL="0" distR="0" wp14:anchorId="5CFDDCE5" wp14:editId="24C2BEBC">
             <wp:extent cx="5943600" cy="1790700"/>
@@ -1307,6 +1343,9 @@
         <w:ind w:left="360"/>
       </w:pPr>
       <w:r>
+        <w:rPr>
+          <w:noProof/>
+        </w:rPr>
         <w:drawing>
           <wp:inline distT="0" distB="0" distL="0" distR="0" wp14:anchorId="104CD0EB" wp14:editId="668F1DE7">
             <wp:extent cx="5943600" cy="1752600"/>
@@ -1411,6 +1450,9 @@
         <w:ind w:left="360"/>
       </w:pPr>
       <w:r>
+        <w:rPr>
+          <w:noProof/>
+        </w:rPr>
         <w:drawing>
           <wp:inline distT="0" distB="0" distL="0" distR="0" wp14:anchorId="44B95C49" wp14:editId="16162EF2">
             <wp:extent cx="5649113" cy="1448002"/>
@@ -1510,6 +1552,89 @@
     <w:p>
       <w:pPr>
         <w:pStyle w:val="ListParagraph"/>
+        <w:ind w:left="360"/>
+      </w:pPr>
+    </w:p>
+    <w:p>
+      <w:pPr>
+        <w:pStyle w:val="ListParagraph"/>
+        <w:numPr>
+          <w:ilvl w:val="0"/>
+          <w:numId w:val="5"/>
+        </w:numPr>
+      </w:pPr>
+      <w:r>
+        <w:t xml:space="preserve">Step 10 - Created the </w:t>
+      </w:r>
+      <w:proofErr w:type="spellStart"/>
+      <w:r>
+        <w:t>movielens</w:t>
+      </w:r>
+      <w:proofErr w:type="spellEnd"/>
+      <w:r>
+        <w:t xml:space="preserve"> database and initialized the movies table with columns </w:t>
+      </w:r>
+      <w:proofErr w:type="spellStart"/>
+      <w:r>
+        <w:t>idx</w:t>
+      </w:r>
+      <w:proofErr w:type="spellEnd"/>
+      <w:r>
+        <w:t>, title, and genres. Executed SELECT * FROM movies; to verify that the table was initially empty.</w:t>
+      </w:r>
+    </w:p>
+    <w:p>
+      <w:pPr>
+        <w:pStyle w:val="ListParagraph"/>
+        <w:ind w:left="360"/>
+      </w:pPr>
+      <w:r>
+        <w:drawing>
+          <wp:inline distT="0" distB="0" distL="0" distR="0" wp14:anchorId="30256ACC" wp14:editId="6AFE4767">
+            <wp:extent cx="5943600" cy="3719830"/>
+            <wp:effectExtent l="0" t="0" r="0" b="0"/>
+            <wp:docPr id="1153400102" name="Picture 1"/>
+            <wp:cNvGraphicFramePr>
+              <a:graphicFrameLocks xmlns:a="http://schemas.openxmlformats.org/drawingml/2006/main" noChangeAspect="1"/>
+            </wp:cNvGraphicFramePr>
+            <a:graphic xmlns:a="http://schemas.openxmlformats.org/drawingml/2006/main">
+              <a:graphicData uri="http://schemas.openxmlformats.org/drawingml/2006/picture">
+                <pic:pic xmlns:pic="http://schemas.openxmlformats.org/drawingml/2006/picture">
+                  <pic:nvPicPr>
+                    <pic:cNvPr id="1153400102" name=""/>
+                    <pic:cNvPicPr/>
+                  </pic:nvPicPr>
+                  <pic:blipFill>
+                    <a:blip r:embed="rId19"/>
+                    <a:stretch>
+                      <a:fillRect/>
+                    </a:stretch>
+                  </pic:blipFill>
+                  <pic:spPr>
+                    <a:xfrm>
+                      <a:off x="0" y="0"/>
+                      <a:ext cx="5943600" cy="3719830"/>
+                    </a:xfrm>
+                    <a:prstGeom prst="rect">
+                      <a:avLst/>
+                    </a:prstGeom>
+                  </pic:spPr>
+                </pic:pic>
+              </a:graphicData>
+            </a:graphic>
+          </wp:inline>
+        </w:drawing>
+      </w:r>
+    </w:p>
+    <w:p>
+      <w:pPr>
+        <w:pStyle w:val="ListParagraph"/>
+        <w:ind w:left="360"/>
+      </w:pPr>
+    </w:p>
+    <w:p>
+      <w:pPr>
+        <w:pStyle w:val="ListParagraph"/>
         <w:numPr>
           <w:ilvl w:val="0"/>
           <w:numId w:val="2"/>
@@ -1531,6 +1656,248 @@
     <w:p>
       <w:pPr>
         <w:pStyle w:val="ListParagraph"/>
+        <w:ind w:left="360"/>
+      </w:pPr>
+    </w:p>
+    <w:p>
+      <w:pPr>
+        <w:pStyle w:val="ListParagraph"/>
+        <w:numPr>
+          <w:ilvl w:val="0"/>
+          <w:numId w:val="5"/>
+        </w:numPr>
+      </w:pPr>
+      <w:r>
+        <w:t xml:space="preserve">Copy from local machine to </w:t>
+      </w:r>
+      <w:proofErr w:type="spellStart"/>
+      <w:r>
+        <w:t>NiFi</w:t>
+      </w:r>
+      <w:proofErr w:type="spellEnd"/>
+      <w:r>
+        <w:t xml:space="preserve"> container </w:t>
+      </w:r>
+      <w:r>
+        <w:t>/opt/</w:t>
+      </w:r>
+      <w:proofErr w:type="spellStart"/>
+      <w:r>
+        <w:t>nifi</w:t>
+      </w:r>
+      <w:proofErr w:type="spellEnd"/>
+      <w:r>
+        <w:t>/</w:t>
+      </w:r>
+      <w:proofErr w:type="spellStart"/>
+      <w:r>
+        <w:t>nifi</w:t>
+      </w:r>
+      <w:proofErr w:type="spellEnd"/>
+      <w:r>
+        <w:t>-current/data</w:t>
+      </w:r>
+      <w:r>
+        <w:t xml:space="preserve"> directory.</w:t>
+      </w:r>
+    </w:p>
+    <w:p>
+      <w:pPr>
+        <w:pStyle w:val="ListParagraph"/>
+        <w:ind w:left="360"/>
+      </w:pPr>
+      <w:r>
+        <w:drawing>
+          <wp:inline distT="0" distB="0" distL="0" distR="0" wp14:anchorId="06CEB2E5" wp14:editId="5042E080">
+            <wp:extent cx="6396420" cy="675861"/>
+            <wp:effectExtent l="0" t="0" r="4445" b="0"/>
+            <wp:docPr id="797328049" name="Picture 1"/>
+            <wp:cNvGraphicFramePr>
+              <a:graphicFrameLocks xmlns:a="http://schemas.openxmlformats.org/drawingml/2006/main" noChangeAspect="1"/>
+            </wp:cNvGraphicFramePr>
+            <a:graphic xmlns:a="http://schemas.openxmlformats.org/drawingml/2006/main">
+              <a:graphicData uri="http://schemas.openxmlformats.org/drawingml/2006/picture">
+                <pic:pic xmlns:pic="http://schemas.openxmlformats.org/drawingml/2006/picture">
+                  <pic:nvPicPr>
+                    <pic:cNvPr id="797328049" name=""/>
+                    <pic:cNvPicPr/>
+                  </pic:nvPicPr>
+                  <pic:blipFill>
+                    <a:blip r:embed="rId20"/>
+                    <a:stretch>
+                      <a:fillRect/>
+                    </a:stretch>
+                  </pic:blipFill>
+                  <pic:spPr>
+                    <a:xfrm>
+                      <a:off x="0" y="0"/>
+                      <a:ext cx="6449408" cy="681460"/>
+                    </a:xfrm>
+                    <a:prstGeom prst="rect">
+                      <a:avLst/>
+                    </a:prstGeom>
+                  </pic:spPr>
+                </pic:pic>
+              </a:graphicData>
+            </a:graphic>
+          </wp:inline>
+        </w:drawing>
+      </w:r>
+    </w:p>
+    <w:p>
+      <w:pPr>
+        <w:pStyle w:val="ListParagraph"/>
+        <w:ind w:left="360"/>
+      </w:pPr>
+    </w:p>
+    <w:p>
+      <w:pPr>
+        <w:pStyle w:val="ListParagraph"/>
+        <w:ind w:left="360"/>
+      </w:pPr>
+    </w:p>
+    <w:p>
+      <w:pPr>
+        <w:pStyle w:val="ListParagraph"/>
+        <w:ind w:left="360"/>
+      </w:pPr>
+    </w:p>
+    <w:p>
+      <w:pPr>
+        <w:pStyle w:val="ListParagraph"/>
+        <w:ind w:left="360"/>
+      </w:pPr>
+    </w:p>
+    <w:p>
+      <w:pPr>
+        <w:pStyle w:val="ListParagraph"/>
+        <w:ind w:left="360"/>
+      </w:pPr>
+    </w:p>
+    <w:p>
+      <w:pPr>
+        <w:pStyle w:val="ListParagraph"/>
+        <w:ind w:left="360"/>
+      </w:pPr>
+    </w:p>
+    <w:p>
+      <w:pPr>
+        <w:pStyle w:val="ListParagraph"/>
+        <w:ind w:left="360"/>
+      </w:pPr>
+    </w:p>
+    <w:p>
+      <w:pPr>
+        <w:pStyle w:val="ListParagraph"/>
+        <w:ind w:left="360"/>
+      </w:pPr>
+    </w:p>
+    <w:p>
+      <w:pPr>
+        <w:pStyle w:val="ListParagraph"/>
+        <w:ind w:left="360"/>
+      </w:pPr>
+    </w:p>
+    <w:p>
+      <w:pPr>
+        <w:pStyle w:val="ListParagraph"/>
+        <w:numPr>
+          <w:ilvl w:val="0"/>
+          <w:numId w:val="5"/>
+        </w:numPr>
+      </w:pPr>
+      <w:r>
+        <w:lastRenderedPageBreak/>
+        <w:t>Step 11 - Copied the movies.csv file into the /opt/</w:t>
+      </w:r>
+      <w:proofErr w:type="spellStart"/>
+      <w:r>
+        <w:t>nifi</w:t>
+      </w:r>
+      <w:proofErr w:type="spellEnd"/>
+      <w:r>
+        <w:t>/</w:t>
+      </w:r>
+      <w:proofErr w:type="spellStart"/>
+      <w:r>
+        <w:t>nifi</w:t>
+      </w:r>
+      <w:proofErr w:type="spellEnd"/>
+      <w:r>
+        <w:t xml:space="preserve">-current/data directory inside the </w:t>
+      </w:r>
+      <w:proofErr w:type="spellStart"/>
+      <w:r>
+        <w:t>NiFi</w:t>
+      </w:r>
+      <w:proofErr w:type="spellEnd"/>
+      <w:r>
+        <w:t xml:space="preserve"> container and verified that the file was successfully uploaded for processing.</w:t>
+      </w:r>
+    </w:p>
+    <w:p>
+      <w:pPr>
+        <w:pStyle w:val="ListParagraph"/>
+      </w:pPr>
+    </w:p>
+    <w:p>
+      <w:pPr>
+        <w:pStyle w:val="ListParagraph"/>
+        <w:ind w:left="360"/>
+      </w:pPr>
+      <w:r>
+        <w:drawing>
+          <wp:inline distT="0" distB="0" distL="0" distR="0" wp14:anchorId="08A9CA26" wp14:editId="4AFAE3BF">
+            <wp:extent cx="5943600" cy="2462530"/>
+            <wp:effectExtent l="0" t="0" r="0" b="0"/>
+            <wp:docPr id="756169224" name="Picture 1"/>
+            <wp:cNvGraphicFramePr>
+              <a:graphicFrameLocks xmlns:a="http://schemas.openxmlformats.org/drawingml/2006/main" noChangeAspect="1"/>
+            </wp:cNvGraphicFramePr>
+            <a:graphic xmlns:a="http://schemas.openxmlformats.org/drawingml/2006/main">
+              <a:graphicData uri="http://schemas.openxmlformats.org/drawingml/2006/picture">
+                <pic:pic xmlns:pic="http://schemas.openxmlformats.org/drawingml/2006/picture">
+                  <pic:nvPicPr>
+                    <pic:cNvPr id="756169224" name=""/>
+                    <pic:cNvPicPr/>
+                  </pic:nvPicPr>
+                  <pic:blipFill>
+                    <a:blip r:embed="rId21"/>
+                    <a:stretch>
+                      <a:fillRect/>
+                    </a:stretch>
+                  </pic:blipFill>
+                  <pic:spPr>
+                    <a:xfrm>
+                      <a:off x="0" y="0"/>
+                      <a:ext cx="5943600" cy="2462530"/>
+                    </a:xfrm>
+                    <a:prstGeom prst="rect">
+                      <a:avLst/>
+                    </a:prstGeom>
+                  </pic:spPr>
+                </pic:pic>
+              </a:graphicData>
+            </a:graphic>
+          </wp:inline>
+        </w:drawing>
+      </w:r>
+    </w:p>
+    <w:p>
+      <w:pPr>
+        <w:pStyle w:val="ListParagraph"/>
+        <w:ind w:left="360"/>
+      </w:pPr>
+    </w:p>
+    <w:p>
+      <w:pPr>
+        <w:pStyle w:val="ListParagraph"/>
+        <w:ind w:left="360"/>
+      </w:pPr>
+    </w:p>
+    <w:p>
+      <w:pPr>
+        <w:pStyle w:val="ListParagraph"/>
         <w:numPr>
           <w:ilvl w:val="0"/>
           <w:numId w:val="2"/>
@@ -1552,6 +1919,81 @@
     <w:p>
       <w:pPr>
         <w:pStyle w:val="ListParagraph"/>
+        <w:ind w:left="360"/>
+      </w:pPr>
+    </w:p>
+    <w:p>
+      <w:pPr>
+        <w:pStyle w:val="ListParagraph"/>
+        <w:numPr>
+          <w:ilvl w:val="0"/>
+          <w:numId w:val="5"/>
+        </w:numPr>
+      </w:pPr>
+      <w:r>
+        <w:t xml:space="preserve">Step 12 - Opened the Apache </w:t>
+      </w:r>
+      <w:proofErr w:type="spellStart"/>
+      <w:r>
+        <w:t>NiFi</w:t>
+      </w:r>
+      <w:proofErr w:type="spellEnd"/>
+      <w:r>
+        <w:t xml:space="preserve"> user interface and accessed the Assignment17 process group to begin configuring the CSV-to-MySQL ETL pipeline.</w:t>
+      </w:r>
+    </w:p>
+    <w:p>
+      <w:pPr>
+        <w:pStyle w:val="ListParagraph"/>
+        <w:ind w:left="360"/>
+      </w:pPr>
+      <w:r>
+        <w:drawing>
+          <wp:inline distT="0" distB="0" distL="0" distR="0" wp14:anchorId="7684A19E" wp14:editId="6D0D02AC">
+            <wp:extent cx="5943600" cy="3971925"/>
+            <wp:effectExtent l="0" t="0" r="0" b="9525"/>
+            <wp:docPr id="1881840262" name="Picture 1"/>
+            <wp:cNvGraphicFramePr>
+              <a:graphicFrameLocks xmlns:a="http://schemas.openxmlformats.org/drawingml/2006/main" noChangeAspect="1"/>
+            </wp:cNvGraphicFramePr>
+            <a:graphic xmlns:a="http://schemas.openxmlformats.org/drawingml/2006/main">
+              <a:graphicData uri="http://schemas.openxmlformats.org/drawingml/2006/picture">
+                <pic:pic xmlns:pic="http://schemas.openxmlformats.org/drawingml/2006/picture">
+                  <pic:nvPicPr>
+                    <pic:cNvPr id="1881840262" name=""/>
+                    <pic:cNvPicPr/>
+                  </pic:nvPicPr>
+                  <pic:blipFill>
+                    <a:blip r:embed="rId22"/>
+                    <a:stretch>
+                      <a:fillRect/>
+                    </a:stretch>
+                  </pic:blipFill>
+                  <pic:spPr>
+                    <a:xfrm>
+                      <a:off x="0" y="0"/>
+                      <a:ext cx="5943600" cy="3971925"/>
+                    </a:xfrm>
+                    <a:prstGeom prst="rect">
+                      <a:avLst/>
+                    </a:prstGeom>
+                  </pic:spPr>
+                </pic:pic>
+              </a:graphicData>
+            </a:graphic>
+          </wp:inline>
+        </w:drawing>
+      </w:r>
+    </w:p>
+    <w:p>
+      <w:pPr>
+        <w:pStyle w:val="ListParagraph"/>
+        <w:ind w:left="360"/>
+      </w:pPr>
+    </w:p>
+    <w:p>
+      <w:pPr>
+        <w:pStyle w:val="ListParagraph"/>
         <w:numPr>
           <w:ilvl w:val="0"/>
           <w:numId w:val="2"/>
@@ -1565,6 +2007,198 @@
     <w:p>
       <w:pPr>
         <w:pStyle w:val="ListParagraph"/>
+        <w:ind w:left="360"/>
+      </w:pPr>
+    </w:p>
+    <w:p>
+      <w:pPr>
+        <w:pStyle w:val="ListParagraph"/>
+        <w:numPr>
+          <w:ilvl w:val="0"/>
+          <w:numId w:val="5"/>
+        </w:numPr>
+      </w:pPr>
+      <w:r>
+        <w:t xml:space="preserve">Step 13 - Created and enabled the MySQL </w:t>
+      </w:r>
+      <w:proofErr w:type="spellStart"/>
+      <w:r>
+        <w:t>DBCPConnectionPool</w:t>
+      </w:r>
+      <w:proofErr w:type="spellEnd"/>
+      <w:r>
+        <w:t xml:space="preserve"> controller service using the </w:t>
+      </w:r>
+      <w:proofErr w:type="spellStart"/>
+      <w:r>
+        <w:t>mysqlcontainer</w:t>
+      </w:r>
+      <w:proofErr w:type="spellEnd"/>
+      <w:r>
+        <w:t xml:space="preserve"> Docker container to connect Apache </w:t>
+      </w:r>
+      <w:proofErr w:type="spellStart"/>
+      <w:r>
+        <w:t>NiFi</w:t>
+      </w:r>
+      <w:proofErr w:type="spellEnd"/>
+      <w:r>
+        <w:t xml:space="preserve"> to the </w:t>
+      </w:r>
+      <w:proofErr w:type="spellStart"/>
+      <w:r>
+        <w:t>movielens</w:t>
+      </w:r>
+      <w:proofErr w:type="spellEnd"/>
+      <w:r>
+        <w:t xml:space="preserve"> database.</w:t>
+      </w:r>
+    </w:p>
+    <w:p>
+      <w:pPr>
+        <w:pStyle w:val="ListParagraph"/>
+        <w:ind w:left="360"/>
+      </w:pPr>
+      <w:r>
+        <w:drawing>
+          <wp:inline distT="0" distB="0" distL="0" distR="0" wp14:anchorId="20CF96D3" wp14:editId="55CA2ECC">
+            <wp:extent cx="5128591" cy="3728639"/>
+            <wp:effectExtent l="0" t="0" r="0" b="5715"/>
+            <wp:docPr id="698229596" name="Picture 1"/>
+            <wp:cNvGraphicFramePr>
+              <a:graphicFrameLocks xmlns:a="http://schemas.openxmlformats.org/drawingml/2006/main" noChangeAspect="1"/>
+            </wp:cNvGraphicFramePr>
+            <a:graphic xmlns:a="http://schemas.openxmlformats.org/drawingml/2006/main">
+              <a:graphicData uri="http://schemas.openxmlformats.org/drawingml/2006/picture">
+                <pic:pic xmlns:pic="http://schemas.openxmlformats.org/drawingml/2006/picture">
+                  <pic:nvPicPr>
+                    <pic:cNvPr id="698229596" name=""/>
+                    <pic:cNvPicPr/>
+                  </pic:nvPicPr>
+                  <pic:blipFill>
+                    <a:blip r:embed="rId23"/>
+                    <a:stretch>
+                      <a:fillRect/>
+                    </a:stretch>
+                  </pic:blipFill>
+                  <pic:spPr>
+                    <a:xfrm>
+                      <a:off x="0" y="0"/>
+                      <a:ext cx="5130906" cy="3730322"/>
+                    </a:xfrm>
+                    <a:prstGeom prst="rect">
+                      <a:avLst/>
+                    </a:prstGeom>
+                  </pic:spPr>
+                </pic:pic>
+              </a:graphicData>
+            </a:graphic>
+          </wp:inline>
+        </w:drawing>
+      </w:r>
+    </w:p>
+    <w:p>
+      <w:pPr>
+        <w:pStyle w:val="ListParagraph"/>
+        <w:ind w:left="360"/>
+      </w:pPr>
+    </w:p>
+    <w:p>
+      <w:pPr>
+        <w:pStyle w:val="ListParagraph"/>
+        <w:ind w:left="360"/>
+      </w:pPr>
+      <w:r>
+        <w:drawing>
+          <wp:inline distT="0" distB="0" distL="0" distR="0" wp14:anchorId="29B642D5" wp14:editId="559FE2A3">
+            <wp:extent cx="5128260" cy="2321962"/>
+            <wp:effectExtent l="0" t="0" r="0" b="2540"/>
+            <wp:docPr id="753244501" name="Picture 1"/>
+            <wp:cNvGraphicFramePr>
+              <a:graphicFrameLocks xmlns:a="http://schemas.openxmlformats.org/drawingml/2006/main" noChangeAspect="1"/>
+            </wp:cNvGraphicFramePr>
+            <a:graphic xmlns:a="http://schemas.openxmlformats.org/drawingml/2006/main">
+              <a:graphicData uri="http://schemas.openxmlformats.org/drawingml/2006/picture">
+                <pic:pic xmlns:pic="http://schemas.openxmlformats.org/drawingml/2006/picture">
+                  <pic:nvPicPr>
+                    <pic:cNvPr id="753244501" name=""/>
+                    <pic:cNvPicPr/>
+                  </pic:nvPicPr>
+                  <pic:blipFill>
+                    <a:blip r:embed="rId24"/>
+                    <a:stretch>
+                      <a:fillRect/>
+                    </a:stretch>
+                  </pic:blipFill>
+                  <pic:spPr>
+                    <a:xfrm>
+                      <a:off x="0" y="0"/>
+                      <a:ext cx="5135280" cy="2325141"/>
+                    </a:xfrm>
+                    <a:prstGeom prst="rect">
+                      <a:avLst/>
+                    </a:prstGeom>
+                  </pic:spPr>
+                </pic:pic>
+              </a:graphicData>
+            </a:graphic>
+          </wp:inline>
+        </w:drawing>
+      </w:r>
+    </w:p>
+    <w:p>
+      <w:pPr>
+        <w:pStyle w:val="ListParagraph"/>
+        <w:ind w:left="360"/>
+      </w:pPr>
+    </w:p>
+    <w:p>
+      <w:pPr>
+        <w:pStyle w:val="ListParagraph"/>
+        <w:ind w:left="360"/>
+      </w:pPr>
+      <w:r>
+        <w:lastRenderedPageBreak/>
+        <w:drawing>
+          <wp:inline distT="0" distB="0" distL="0" distR="0" wp14:anchorId="1D562567" wp14:editId="246B2284">
+            <wp:extent cx="6275358" cy="1304014"/>
+            <wp:effectExtent l="0" t="0" r="0" b="0"/>
+            <wp:docPr id="1997456530" name="Picture 1"/>
+            <wp:cNvGraphicFramePr>
+              <a:graphicFrameLocks xmlns:a="http://schemas.openxmlformats.org/drawingml/2006/main" noChangeAspect="1"/>
+            </wp:cNvGraphicFramePr>
+            <a:graphic xmlns:a="http://schemas.openxmlformats.org/drawingml/2006/main">
+              <a:graphicData uri="http://schemas.openxmlformats.org/drawingml/2006/picture">
+                <pic:pic xmlns:pic="http://schemas.openxmlformats.org/drawingml/2006/picture">
+                  <pic:nvPicPr>
+                    <pic:cNvPr id="1997456530" name=""/>
+                    <pic:cNvPicPr/>
+                  </pic:nvPicPr>
+                  <pic:blipFill>
+                    <a:blip r:embed="rId25"/>
+                    <a:stretch>
+                      <a:fillRect/>
+                    </a:stretch>
+                  </pic:blipFill>
+                  <pic:spPr>
+                    <a:xfrm>
+                      <a:off x="0" y="0"/>
+                      <a:ext cx="6278833" cy="1304736"/>
+                    </a:xfrm>
+                    <a:prstGeom prst="rect">
+                      <a:avLst/>
+                    </a:prstGeom>
+                  </pic:spPr>
+                </pic:pic>
+              </a:graphicData>
+            </a:graphic>
+          </wp:inline>
+        </w:drawing>
+      </w:r>
+    </w:p>
+    <w:p>
+      <w:pPr>
+        <w:pStyle w:val="ListParagraph"/>
         <w:numPr>
           <w:ilvl w:val="0"/>
           <w:numId w:val="2"/>
@@ -1578,6 +2212,83 @@
     <w:p>
       <w:pPr>
         <w:pStyle w:val="ListParagraph"/>
+        <w:ind w:left="360"/>
+      </w:pPr>
+    </w:p>
+    <w:p>
+      <w:pPr>
+        <w:pStyle w:val="ListParagraph"/>
+        <w:numPr>
+          <w:ilvl w:val="0"/>
+          <w:numId w:val="5"/>
+        </w:numPr>
+      </w:pPr>
+      <w:r>
+        <w:t xml:space="preserve">Step 14 - Created and enabled the </w:t>
+      </w:r>
+      <w:proofErr w:type="spellStart"/>
+      <w:r>
+        <w:t>CSVRead</w:t>
+      </w:r>
+      <w:proofErr w:type="spellEnd"/>
+      <w:r>
+        <w:t xml:space="preserve">, </w:t>
+      </w:r>
+      <w:proofErr w:type="spellStart"/>
+      <w:r>
+        <w:t>JsonRecordWriter</w:t>
+      </w:r>
+      <w:proofErr w:type="spellEnd"/>
+      <w:r>
+        <w:t>, and MySQL controller services required to support the CSV-to-MySQL ETL pipeline.</w:t>
+      </w:r>
+    </w:p>
+    <w:p>
+      <w:pPr>
+        <w:pStyle w:val="ListParagraph"/>
+        <w:ind w:left="360"/>
+      </w:pPr>
+      <w:r>
+        <w:drawing>
+          <wp:inline distT="0" distB="0" distL="0" distR="0" wp14:anchorId="6D1224FD" wp14:editId="55FB8418">
+            <wp:extent cx="6261957" cy="1176793"/>
+            <wp:effectExtent l="0" t="0" r="5715" b="4445"/>
+            <wp:docPr id="1786117397" name="Picture 1"/>
+            <wp:cNvGraphicFramePr>
+              <a:graphicFrameLocks xmlns:a="http://schemas.openxmlformats.org/drawingml/2006/main" noChangeAspect="1"/>
+            </wp:cNvGraphicFramePr>
+            <a:graphic xmlns:a="http://schemas.openxmlformats.org/drawingml/2006/main">
+              <a:graphicData uri="http://schemas.openxmlformats.org/drawingml/2006/picture">
+                <pic:pic xmlns:pic="http://schemas.openxmlformats.org/drawingml/2006/picture">
+                  <pic:nvPicPr>
+                    <pic:cNvPr id="1786117397" name=""/>
+                    <pic:cNvPicPr/>
+                  </pic:nvPicPr>
+                  <pic:blipFill>
+                    <a:blip r:embed="rId26"/>
+                    <a:stretch>
+                      <a:fillRect/>
+                    </a:stretch>
+                  </pic:blipFill>
+                  <pic:spPr>
+                    <a:xfrm>
+                      <a:off x="0" y="0"/>
+                      <a:ext cx="6269796" cy="1178266"/>
+                    </a:xfrm>
+                    <a:prstGeom prst="rect">
+                      <a:avLst/>
+                    </a:prstGeom>
+                  </pic:spPr>
+                </pic:pic>
+              </a:graphicData>
+            </a:graphic>
+          </wp:inline>
+        </w:drawing>
+      </w:r>
+    </w:p>
+    <w:p>
+      <w:pPr>
+        <w:pStyle w:val="ListParagraph"/>
         <w:numPr>
           <w:ilvl w:val="0"/>
           <w:numId w:val="2"/>
@@ -1631,6 +2342,115 @@
     <w:p>
       <w:pPr>
         <w:pStyle w:val="ListParagraph"/>
+        <w:ind w:left="360"/>
+      </w:pPr>
+    </w:p>
+    <w:p>
+      <w:pPr>
+        <w:pStyle w:val="ListParagraph"/>
+        <w:numPr>
+          <w:ilvl w:val="0"/>
+          <w:numId w:val="5"/>
+        </w:numPr>
+      </w:pPr>
+      <w:r>
+        <w:t>Part 2 Step 6 - Added the five required processors (</w:t>
+      </w:r>
+      <w:proofErr w:type="spellStart"/>
+      <w:r>
+        <w:t>GetFile</w:t>
+      </w:r>
+      <w:proofErr w:type="spellEnd"/>
+      <w:r>
+        <w:t xml:space="preserve">, </w:t>
+      </w:r>
+      <w:proofErr w:type="spellStart"/>
+      <w:r>
+        <w:t>SplitText</w:t>
+      </w:r>
+      <w:proofErr w:type="spellEnd"/>
+      <w:r>
+        <w:t xml:space="preserve">, </w:t>
+      </w:r>
+      <w:proofErr w:type="spellStart"/>
+      <w:r>
+        <w:t>ConvertRecord</w:t>
+      </w:r>
+      <w:proofErr w:type="spellEnd"/>
+      <w:r>
+        <w:t xml:space="preserve">, </w:t>
+      </w:r>
+      <w:proofErr w:type="spellStart"/>
+      <w:r>
+        <w:t>ConvertJSONToSQL</w:t>
+      </w:r>
+      <w:proofErr w:type="spellEnd"/>
+      <w:r>
+        <w:t xml:space="preserve">, and </w:t>
+      </w:r>
+      <w:proofErr w:type="spellStart"/>
+      <w:r>
+        <w:t>PutSQL</w:t>
+      </w:r>
+      <w:proofErr w:type="spellEnd"/>
+      <w:r>
+        <w:t xml:space="preserve">) that will be used to load movie data from a CSV file into the </w:t>
+      </w:r>
+      <w:proofErr w:type="spellStart"/>
+      <w:r>
+        <w:t>movielens</w:t>
+      </w:r>
+      <w:proofErr w:type="spellEnd"/>
+      <w:r>
+        <w:t xml:space="preserve"> MySQL database.</w:t>
+      </w:r>
+    </w:p>
+    <w:p>
+      <w:pPr>
+        <w:pStyle w:val="ListParagraph"/>
+        <w:ind w:left="360" w:firstLine="360"/>
+      </w:pPr>
+      <w:r>
+        <w:drawing>
+          <wp:inline distT="0" distB="0" distL="0" distR="0" wp14:anchorId="50DFA04D" wp14:editId="0CC6BB77">
+            <wp:extent cx="3354678" cy="3562184"/>
+            <wp:effectExtent l="0" t="0" r="0" b="635"/>
+            <wp:docPr id="1648786811" name="Picture 1"/>
+            <wp:cNvGraphicFramePr>
+              <a:graphicFrameLocks xmlns:a="http://schemas.openxmlformats.org/drawingml/2006/main" noChangeAspect="1"/>
+            </wp:cNvGraphicFramePr>
+            <a:graphic xmlns:a="http://schemas.openxmlformats.org/drawingml/2006/main">
+              <a:graphicData uri="http://schemas.openxmlformats.org/drawingml/2006/picture">
+                <pic:pic xmlns:pic="http://schemas.openxmlformats.org/drawingml/2006/picture">
+                  <pic:nvPicPr>
+                    <pic:cNvPr id="1648786811" name=""/>
+                    <pic:cNvPicPr/>
+                  </pic:nvPicPr>
+                  <pic:blipFill>
+                    <a:blip r:embed="rId27"/>
+                    <a:stretch>
+                      <a:fillRect/>
+                    </a:stretch>
+                  </pic:blipFill>
+                  <pic:spPr>
+                    <a:xfrm>
+                      <a:off x="0" y="0"/>
+                      <a:ext cx="3391629" cy="3601420"/>
+                    </a:xfrm>
+                    <a:prstGeom prst="rect">
+                      <a:avLst/>
+                    </a:prstGeom>
+                  </pic:spPr>
+                </pic:pic>
+              </a:graphicData>
+            </a:graphic>
+          </wp:inline>
+        </w:drawing>
+      </w:r>
+    </w:p>
+    <w:p>
+      <w:pPr>
+        <w:pStyle w:val="ListParagraph"/>
         <w:numPr>
           <w:ilvl w:val="0"/>
           <w:numId w:val="2"/>
@@ -1638,7 +2458,779 @@
         <w:ind w:left="360"/>
       </w:pPr>
       <w:r>
+        <w:lastRenderedPageBreak/>
         <w:t>Provide a screenshot of all five processors to show that the correct connectors have been added between the processors.</w:t>
+      </w:r>
+    </w:p>
+    <w:p>
+      <w:pPr>
+        <w:pStyle w:val="ListParagraph"/>
+        <w:ind w:left="360"/>
+      </w:pPr>
+    </w:p>
+    <w:p>
+      <w:pPr>
+        <w:pStyle w:val="ListParagraph"/>
+        <w:numPr>
+          <w:ilvl w:val="0"/>
+          <w:numId w:val="5"/>
+        </w:numPr>
+        <w:spacing w:after="0" w:line="300" w:lineRule="atLeast"/>
+        <w:rPr>
+          <w:rFonts w:ascii="Segoe UI" w:eastAsia="Times New Roman" w:hAnsi="Segoe UI" w:cs="Segoe UI"/>
+          <w:kern w:val="0"/>
+          <w:sz w:val="21"/>
+          <w:szCs w:val="21"/>
+          <w14:ligatures w14:val="none"/>
+        </w:rPr>
+      </w:pPr>
+      <w:r>
+        <w:rPr>
+          <w:rFonts w:ascii="Segoe UI" w:eastAsia="Times New Roman" w:hAnsi="Segoe UI" w:cs="Segoe UI"/>
+          <w:kern w:val="0"/>
+          <w:sz w:val="21"/>
+          <w:szCs w:val="21"/>
+          <w14:ligatures w14:val="none"/>
+        </w:rPr>
+        <w:t>get movies file</w:t>
+      </w:r>
+      <w:r>
+        <w:t>, the Settings tab should be</w:t>
+      </w:r>
+      <w:r>
+        <w:t>:</w:t>
+      </w:r>
+    </w:p>
+    <w:p>
+      <w:pPr>
+        <w:pStyle w:val="ListParagraph"/>
+        <w:ind w:left="360"/>
+      </w:pPr>
+      <w:r>
+        <w:drawing>
+          <wp:inline distT="0" distB="0" distL="0" distR="0" wp14:anchorId="076F8FC0" wp14:editId="2FA5035D">
+            <wp:extent cx="4444779" cy="3138413"/>
+            <wp:effectExtent l="0" t="0" r="0" b="5080"/>
+            <wp:docPr id="958732463" name="Picture 1"/>
+            <wp:cNvGraphicFramePr>
+              <a:graphicFrameLocks xmlns:a="http://schemas.openxmlformats.org/drawingml/2006/main" noChangeAspect="1"/>
+            </wp:cNvGraphicFramePr>
+            <a:graphic xmlns:a="http://schemas.openxmlformats.org/drawingml/2006/main">
+              <a:graphicData uri="http://schemas.openxmlformats.org/drawingml/2006/picture">
+                <pic:pic xmlns:pic="http://schemas.openxmlformats.org/drawingml/2006/picture">
+                  <pic:nvPicPr>
+                    <pic:cNvPr id="958732463" name=""/>
+                    <pic:cNvPicPr/>
+                  </pic:nvPicPr>
+                  <pic:blipFill>
+                    <a:blip r:embed="rId28"/>
+                    <a:stretch>
+                      <a:fillRect/>
+                    </a:stretch>
+                  </pic:blipFill>
+                  <pic:spPr>
+                    <a:xfrm>
+                      <a:off x="0" y="0"/>
+                      <a:ext cx="4449560" cy="3141789"/>
+                    </a:xfrm>
+                    <a:prstGeom prst="rect">
+                      <a:avLst/>
+                    </a:prstGeom>
+                  </pic:spPr>
+                </pic:pic>
+              </a:graphicData>
+            </a:graphic>
+          </wp:inline>
+        </w:drawing>
+      </w:r>
+    </w:p>
+    <w:p>
+      <w:pPr>
+        <w:pStyle w:val="ListParagraph"/>
+        <w:ind w:left="360"/>
+      </w:pPr>
+      <w:r>
+        <w:drawing>
+          <wp:inline distT="0" distB="0" distL="0" distR="0" wp14:anchorId="1ED42DF1" wp14:editId="5E3C067D">
+            <wp:extent cx="4444365" cy="3141919"/>
+            <wp:effectExtent l="0" t="0" r="0" b="1905"/>
+            <wp:docPr id="1513136918" name="Picture 1"/>
+            <wp:cNvGraphicFramePr>
+              <a:graphicFrameLocks xmlns:a="http://schemas.openxmlformats.org/drawingml/2006/main" noChangeAspect="1"/>
+            </wp:cNvGraphicFramePr>
+            <a:graphic xmlns:a="http://schemas.openxmlformats.org/drawingml/2006/main">
+              <a:graphicData uri="http://schemas.openxmlformats.org/drawingml/2006/picture">
+                <pic:pic xmlns:pic="http://schemas.openxmlformats.org/drawingml/2006/picture">
+                  <pic:nvPicPr>
+                    <pic:cNvPr id="1513136918" name=""/>
+                    <pic:cNvPicPr/>
+                  </pic:nvPicPr>
+                  <pic:blipFill>
+                    <a:blip r:embed="rId29"/>
+                    <a:stretch>
+                      <a:fillRect/>
+                    </a:stretch>
+                  </pic:blipFill>
+                  <pic:spPr>
+                    <a:xfrm>
+                      <a:off x="0" y="0"/>
+                      <a:ext cx="4453151" cy="3148130"/>
+                    </a:xfrm>
+                    <a:prstGeom prst="rect">
+                      <a:avLst/>
+                    </a:prstGeom>
+                  </pic:spPr>
+                </pic:pic>
+              </a:graphicData>
+            </a:graphic>
+          </wp:inline>
+        </w:drawing>
+      </w:r>
+    </w:p>
+    <w:p>
+      <w:pPr>
+        <w:pStyle w:val="ListParagraph"/>
+        <w:ind w:left="360"/>
+      </w:pPr>
+    </w:p>
+    <w:p>
+      <w:pPr>
+        <w:pStyle w:val="ListParagraph"/>
+        <w:ind w:left="360"/>
+      </w:pPr>
+    </w:p>
+    <w:p>
+      <w:pPr>
+        <w:pStyle w:val="ListParagraph"/>
+        <w:ind w:left="360"/>
+      </w:pPr>
+    </w:p>
+    <w:p>
+      <w:pPr>
+        <w:pStyle w:val="ListParagraph"/>
+        <w:ind w:left="360"/>
+      </w:pPr>
+    </w:p>
+    <w:p>
+      <w:pPr>
+        <w:pStyle w:val="ListParagraph"/>
+        <w:ind w:left="360"/>
+      </w:pPr>
+    </w:p>
+    <w:p>
+      <w:pPr>
+        <w:pStyle w:val="ListParagraph"/>
+        <w:ind w:left="360"/>
+      </w:pPr>
+    </w:p>
+    <w:p>
+      <w:pPr>
+        <w:pStyle w:val="ListParagraph"/>
+        <w:numPr>
+          <w:ilvl w:val="0"/>
+          <w:numId w:val="5"/>
+        </w:numPr>
+      </w:pPr>
+      <w:proofErr w:type="spellStart"/>
+      <w:r>
+        <w:lastRenderedPageBreak/>
+        <w:t>SplitText</w:t>
+      </w:r>
+      <w:proofErr w:type="spellEnd"/>
+      <w:r>
+        <w:t xml:space="preserve">, </w:t>
+      </w:r>
+      <w:r>
+        <w:t>the Settings tab should be</w:t>
+      </w:r>
+      <w:r>
+        <w:t>:</w:t>
+      </w:r>
+    </w:p>
+    <w:p>
+      <w:pPr>
+        <w:pStyle w:val="ListParagraph"/>
+        <w:ind w:left="360"/>
+      </w:pPr>
+      <w:r>
+        <w:drawing>
+          <wp:inline distT="0" distB="0" distL="0" distR="0" wp14:anchorId="0454FC13" wp14:editId="0CA018F5">
+            <wp:extent cx="4672017" cy="3283889"/>
+            <wp:effectExtent l="0" t="0" r="0" b="0"/>
+            <wp:docPr id="1097913358" name="Picture 1"/>
+            <wp:cNvGraphicFramePr>
+              <a:graphicFrameLocks xmlns:a="http://schemas.openxmlformats.org/drawingml/2006/main" noChangeAspect="1"/>
+            </wp:cNvGraphicFramePr>
+            <a:graphic xmlns:a="http://schemas.openxmlformats.org/drawingml/2006/main">
+              <a:graphicData uri="http://schemas.openxmlformats.org/drawingml/2006/picture">
+                <pic:pic xmlns:pic="http://schemas.openxmlformats.org/drawingml/2006/picture">
+                  <pic:nvPicPr>
+                    <pic:cNvPr id="1097913358" name=""/>
+                    <pic:cNvPicPr/>
+                  </pic:nvPicPr>
+                  <pic:blipFill>
+                    <a:blip r:embed="rId30"/>
+                    <a:stretch>
+                      <a:fillRect/>
+                    </a:stretch>
+                  </pic:blipFill>
+                  <pic:spPr>
+                    <a:xfrm>
+                      <a:off x="0" y="0"/>
+                      <a:ext cx="4675149" cy="3286090"/>
+                    </a:xfrm>
+                    <a:prstGeom prst="rect">
+                      <a:avLst/>
+                    </a:prstGeom>
+                  </pic:spPr>
+                </pic:pic>
+              </a:graphicData>
+            </a:graphic>
+          </wp:inline>
+        </w:drawing>
+      </w:r>
+    </w:p>
+    <w:p>
+      <w:pPr>
+        <w:pStyle w:val="ListParagraph"/>
+        <w:ind w:left="360"/>
+      </w:pPr>
+      <w:r>
+        <w:drawing>
+          <wp:inline distT="0" distB="0" distL="0" distR="0" wp14:anchorId="36AD843B" wp14:editId="0470C37A">
+            <wp:extent cx="4671695" cy="3331577"/>
+            <wp:effectExtent l="0" t="0" r="0" b="2540"/>
+            <wp:docPr id="1710681643" name="Picture 1"/>
+            <wp:cNvGraphicFramePr>
+              <a:graphicFrameLocks xmlns:a="http://schemas.openxmlformats.org/drawingml/2006/main" noChangeAspect="1"/>
+            </wp:cNvGraphicFramePr>
+            <a:graphic xmlns:a="http://schemas.openxmlformats.org/drawingml/2006/main">
+              <a:graphicData uri="http://schemas.openxmlformats.org/drawingml/2006/picture">
+                <pic:pic xmlns:pic="http://schemas.openxmlformats.org/drawingml/2006/picture">
+                  <pic:nvPicPr>
+                    <pic:cNvPr id="1710681643" name=""/>
+                    <pic:cNvPicPr/>
+                  </pic:nvPicPr>
+                  <pic:blipFill>
+                    <a:blip r:embed="rId31"/>
+                    <a:stretch>
+                      <a:fillRect/>
+                    </a:stretch>
+                  </pic:blipFill>
+                  <pic:spPr>
+                    <a:xfrm>
+                      <a:off x="0" y="0"/>
+                      <a:ext cx="4679320" cy="3337015"/>
+                    </a:xfrm>
+                    <a:prstGeom prst="rect">
+                      <a:avLst/>
+                    </a:prstGeom>
+                  </pic:spPr>
+                </pic:pic>
+              </a:graphicData>
+            </a:graphic>
+          </wp:inline>
+        </w:drawing>
+      </w:r>
+    </w:p>
+    <w:p>
+      <w:pPr>
+        <w:pStyle w:val="ListParagraph"/>
+        <w:ind w:left="360"/>
+      </w:pPr>
+    </w:p>
+    <w:p>
+      <w:pPr>
+        <w:pStyle w:val="ListParagraph"/>
+        <w:ind w:left="360"/>
+      </w:pPr>
+    </w:p>
+    <w:p>
+      <w:pPr>
+        <w:pStyle w:val="ListParagraph"/>
+        <w:ind w:left="360"/>
+      </w:pPr>
+    </w:p>
+    <w:p>
+      <w:pPr>
+        <w:pStyle w:val="ListParagraph"/>
+        <w:ind w:left="360"/>
+      </w:pPr>
+    </w:p>
+    <w:p>
+      <w:pPr>
+        <w:pStyle w:val="ListParagraph"/>
+        <w:ind w:left="360"/>
+      </w:pPr>
+    </w:p>
+    <w:p>
+      <w:pPr>
+        <w:pStyle w:val="ListParagraph"/>
+        <w:ind w:left="360"/>
+      </w:pPr>
+    </w:p>
+    <w:p>
+      <w:pPr>
+        <w:pStyle w:val="ListParagraph"/>
+        <w:ind w:left="360"/>
+      </w:pPr>
+    </w:p>
+    <w:p>
+      <w:pPr>
+        <w:pStyle w:val="ListParagraph"/>
+        <w:numPr>
+          <w:ilvl w:val="0"/>
+          <w:numId w:val="5"/>
+        </w:numPr>
+      </w:pPr>
+      <w:r>
+        <w:lastRenderedPageBreak/>
+        <w:t xml:space="preserve">For </w:t>
+      </w:r>
+      <w:proofErr w:type="spellStart"/>
+      <w:r>
+        <w:t>ConvertRecord</w:t>
+      </w:r>
+      <w:proofErr w:type="spellEnd"/>
+      <w:r>
+        <w:t>, the Settings tab should be</w:t>
+      </w:r>
+      <w:r>
+        <w:t>:</w:t>
+      </w:r>
+    </w:p>
+    <w:p>
+      <w:pPr>
+        <w:pStyle w:val="ListParagraph"/>
+        <w:ind w:left="360"/>
+      </w:pPr>
+      <w:r>
+        <w:drawing>
+          <wp:inline distT="0" distB="0" distL="0" distR="0" wp14:anchorId="3F49712B" wp14:editId="43630869">
+            <wp:extent cx="4749292" cy="3379304"/>
+            <wp:effectExtent l="0" t="0" r="0" b="0"/>
+            <wp:docPr id="884649190" name="Picture 1"/>
+            <wp:cNvGraphicFramePr>
+              <a:graphicFrameLocks xmlns:a="http://schemas.openxmlformats.org/drawingml/2006/main" noChangeAspect="1"/>
+            </wp:cNvGraphicFramePr>
+            <a:graphic xmlns:a="http://schemas.openxmlformats.org/drawingml/2006/main">
+              <a:graphicData uri="http://schemas.openxmlformats.org/drawingml/2006/picture">
+                <pic:pic xmlns:pic="http://schemas.openxmlformats.org/drawingml/2006/picture">
+                  <pic:nvPicPr>
+                    <pic:cNvPr id="884649190" name=""/>
+                    <pic:cNvPicPr/>
+                  </pic:nvPicPr>
+                  <pic:blipFill>
+                    <a:blip r:embed="rId32"/>
+                    <a:stretch>
+                      <a:fillRect/>
+                    </a:stretch>
+                  </pic:blipFill>
+                  <pic:spPr>
+                    <a:xfrm>
+                      <a:off x="0" y="0"/>
+                      <a:ext cx="4762821" cy="3388930"/>
+                    </a:xfrm>
+                    <a:prstGeom prst="rect">
+                      <a:avLst/>
+                    </a:prstGeom>
+                  </pic:spPr>
+                </pic:pic>
+              </a:graphicData>
+            </a:graphic>
+          </wp:inline>
+        </w:drawing>
+      </w:r>
+    </w:p>
+    <w:p>
+      <w:pPr>
+        <w:pStyle w:val="ListParagraph"/>
+        <w:ind w:left="360"/>
+      </w:pPr>
+      <w:r>
+        <w:drawing>
+          <wp:inline distT="0" distB="0" distL="0" distR="0" wp14:anchorId="775FF39F" wp14:editId="7A42488F">
+            <wp:extent cx="4746929" cy="3377621"/>
+            <wp:effectExtent l="0" t="0" r="0" b="0"/>
+            <wp:docPr id="1823540310" name="Picture 1"/>
+            <wp:cNvGraphicFramePr>
+              <a:graphicFrameLocks xmlns:a="http://schemas.openxmlformats.org/drawingml/2006/main" noChangeAspect="1"/>
+            </wp:cNvGraphicFramePr>
+            <a:graphic xmlns:a="http://schemas.openxmlformats.org/drawingml/2006/main">
+              <a:graphicData uri="http://schemas.openxmlformats.org/drawingml/2006/picture">
+                <pic:pic xmlns:pic="http://schemas.openxmlformats.org/drawingml/2006/picture">
+                  <pic:nvPicPr>
+                    <pic:cNvPr id="1823540310" name=""/>
+                    <pic:cNvPicPr/>
+                  </pic:nvPicPr>
+                  <pic:blipFill>
+                    <a:blip r:embed="rId33"/>
+                    <a:stretch>
+                      <a:fillRect/>
+                    </a:stretch>
+                  </pic:blipFill>
+                  <pic:spPr>
+                    <a:xfrm>
+                      <a:off x="0" y="0"/>
+                      <a:ext cx="4753759" cy="3382481"/>
+                    </a:xfrm>
+                    <a:prstGeom prst="rect">
+                      <a:avLst/>
+                    </a:prstGeom>
+                  </pic:spPr>
+                </pic:pic>
+              </a:graphicData>
+            </a:graphic>
+          </wp:inline>
+        </w:drawing>
+      </w:r>
+    </w:p>
+    <w:p>
+      <w:pPr>
+        <w:pStyle w:val="ListParagraph"/>
+        <w:ind w:left="360"/>
+      </w:pPr>
+    </w:p>
+    <w:p>
+      <w:pPr>
+        <w:pStyle w:val="ListParagraph"/>
+        <w:ind w:left="360"/>
+      </w:pPr>
+    </w:p>
+    <w:p>
+      <w:pPr>
+        <w:pStyle w:val="ListParagraph"/>
+        <w:ind w:left="360"/>
+      </w:pPr>
+    </w:p>
+    <w:p>
+      <w:pPr>
+        <w:pStyle w:val="ListParagraph"/>
+        <w:ind w:left="360"/>
+      </w:pPr>
+    </w:p>
+    <w:p>
+      <w:pPr>
+        <w:pStyle w:val="ListParagraph"/>
+        <w:ind w:left="360"/>
+      </w:pPr>
+    </w:p>
+    <w:p>
+      <w:pPr>
+        <w:pStyle w:val="ListParagraph"/>
+        <w:ind w:left="360"/>
+      </w:pPr>
+    </w:p>
+    <w:p>
+      <w:pPr>
+        <w:pStyle w:val="ListParagraph"/>
+        <w:numPr>
+          <w:ilvl w:val="0"/>
+          <w:numId w:val="5"/>
+        </w:numPr>
+      </w:pPr>
+      <w:proofErr w:type="spellStart"/>
+      <w:r>
+        <w:lastRenderedPageBreak/>
+        <w:t>ConvertJSONToSQL</w:t>
+      </w:r>
+      <w:proofErr w:type="spellEnd"/>
+      <w:r>
+        <w:t>, the setting should be:</w:t>
+      </w:r>
+    </w:p>
+    <w:p>
+      <w:pPr>
+        <w:pStyle w:val="ListParagraph"/>
+        <w:ind w:left="360"/>
+      </w:pPr>
+      <w:r>
+        <w:drawing>
+          <wp:inline distT="0" distB="0" distL="0" distR="0" wp14:anchorId="7C544174" wp14:editId="5EE4953F">
+            <wp:extent cx="4872546" cy="3450866"/>
+            <wp:effectExtent l="0" t="0" r="4445" b="0"/>
+            <wp:docPr id="2005474409" name="Picture 1"/>
+            <wp:cNvGraphicFramePr>
+              <a:graphicFrameLocks xmlns:a="http://schemas.openxmlformats.org/drawingml/2006/main" noChangeAspect="1"/>
+            </wp:cNvGraphicFramePr>
+            <a:graphic xmlns:a="http://schemas.openxmlformats.org/drawingml/2006/main">
+              <a:graphicData uri="http://schemas.openxmlformats.org/drawingml/2006/picture">
+                <pic:pic xmlns:pic="http://schemas.openxmlformats.org/drawingml/2006/picture">
+                  <pic:nvPicPr>
+                    <pic:cNvPr id="2005474409" name=""/>
+                    <pic:cNvPicPr/>
+                  </pic:nvPicPr>
+                  <pic:blipFill>
+                    <a:blip r:embed="rId34"/>
+                    <a:stretch>
+                      <a:fillRect/>
+                    </a:stretch>
+                  </pic:blipFill>
+                  <pic:spPr>
+                    <a:xfrm>
+                      <a:off x="0" y="0"/>
+                      <a:ext cx="4878384" cy="3455000"/>
+                    </a:xfrm>
+                    <a:prstGeom prst="rect">
+                      <a:avLst/>
+                    </a:prstGeom>
+                  </pic:spPr>
+                </pic:pic>
+              </a:graphicData>
+            </a:graphic>
+          </wp:inline>
+        </w:drawing>
+      </w:r>
+    </w:p>
+    <w:p>
+      <w:pPr>
+        <w:pStyle w:val="ListParagraph"/>
+        <w:ind w:left="360"/>
+      </w:pPr>
+      <w:r>
+        <w:drawing>
+          <wp:inline distT="0" distB="0" distL="0" distR="0" wp14:anchorId="4C3B58AB" wp14:editId="19E4E5AF">
+            <wp:extent cx="4872355" cy="3490813"/>
+            <wp:effectExtent l="0" t="0" r="4445" b="0"/>
+            <wp:docPr id="751111854" name="Picture 1"/>
+            <wp:cNvGraphicFramePr>
+              <a:graphicFrameLocks xmlns:a="http://schemas.openxmlformats.org/drawingml/2006/main" noChangeAspect="1"/>
+            </wp:cNvGraphicFramePr>
+            <a:graphic xmlns:a="http://schemas.openxmlformats.org/drawingml/2006/main">
+              <a:graphicData uri="http://schemas.openxmlformats.org/drawingml/2006/picture">
+                <pic:pic xmlns:pic="http://schemas.openxmlformats.org/drawingml/2006/picture">
+                  <pic:nvPicPr>
+                    <pic:cNvPr id="751111854" name=""/>
+                    <pic:cNvPicPr/>
+                  </pic:nvPicPr>
+                  <pic:blipFill>
+                    <a:blip r:embed="rId35"/>
+                    <a:stretch>
+                      <a:fillRect/>
+                    </a:stretch>
+                  </pic:blipFill>
+                  <pic:spPr>
+                    <a:xfrm>
+                      <a:off x="0" y="0"/>
+                      <a:ext cx="4881146" cy="3497111"/>
+                    </a:xfrm>
+                    <a:prstGeom prst="rect">
+                      <a:avLst/>
+                    </a:prstGeom>
+                  </pic:spPr>
+                </pic:pic>
+              </a:graphicData>
+            </a:graphic>
+          </wp:inline>
+        </w:drawing>
+      </w:r>
+    </w:p>
+    <w:p>
+      <w:pPr>
+        <w:pStyle w:val="ListParagraph"/>
+        <w:ind w:left="360"/>
+      </w:pPr>
+    </w:p>
+    <w:p>
+      <w:pPr>
+        <w:pStyle w:val="ListParagraph"/>
+        <w:ind w:left="360"/>
+      </w:pPr>
+    </w:p>
+    <w:p>
+      <w:pPr>
+        <w:pStyle w:val="ListParagraph"/>
+        <w:ind w:left="360"/>
+      </w:pPr>
+    </w:p>
+    <w:p>
+      <w:pPr>
+        <w:pStyle w:val="ListParagraph"/>
+        <w:ind w:left="360"/>
+      </w:pPr>
+    </w:p>
+    <w:p>
+      <w:pPr>
+        <w:pStyle w:val="ListParagraph"/>
+        <w:ind w:left="360"/>
+      </w:pPr>
+    </w:p>
+    <w:p>
+      <w:pPr>
+        <w:pStyle w:val="ListParagraph"/>
+        <w:numPr>
+          <w:ilvl w:val="0"/>
+          <w:numId w:val="5"/>
+        </w:numPr>
+      </w:pPr>
+      <w:proofErr w:type="spellStart"/>
+      <w:r>
+        <w:lastRenderedPageBreak/>
+        <w:t>PutSQL</w:t>
+      </w:r>
+      <w:proofErr w:type="spellEnd"/>
+      <w:r>
+        <w:t>, setting should be:</w:t>
+      </w:r>
+    </w:p>
+    <w:p>
+      <w:pPr>
+        <w:pStyle w:val="ListParagraph"/>
+        <w:ind w:left="360"/>
+      </w:pPr>
+      <w:r>
+        <w:drawing>
+          <wp:inline distT="0" distB="0" distL="0" distR="0" wp14:anchorId="5EF703F0" wp14:editId="3DCA0F72">
+            <wp:extent cx="5160640" cy="3697356"/>
+            <wp:effectExtent l="0" t="0" r="2540" b="0"/>
+            <wp:docPr id="603556869" name="Picture 1"/>
+            <wp:cNvGraphicFramePr>
+              <a:graphicFrameLocks xmlns:a="http://schemas.openxmlformats.org/drawingml/2006/main" noChangeAspect="1"/>
+            </wp:cNvGraphicFramePr>
+            <a:graphic xmlns:a="http://schemas.openxmlformats.org/drawingml/2006/main">
+              <a:graphicData uri="http://schemas.openxmlformats.org/drawingml/2006/picture">
+                <pic:pic xmlns:pic="http://schemas.openxmlformats.org/drawingml/2006/picture">
+                  <pic:nvPicPr>
+                    <pic:cNvPr id="603556869" name=""/>
+                    <pic:cNvPicPr/>
+                  </pic:nvPicPr>
+                  <pic:blipFill>
+                    <a:blip r:embed="rId36"/>
+                    <a:stretch>
+                      <a:fillRect/>
+                    </a:stretch>
+                  </pic:blipFill>
+                  <pic:spPr>
+                    <a:xfrm>
+                      <a:off x="0" y="0"/>
+                      <a:ext cx="5171435" cy="3705090"/>
+                    </a:xfrm>
+                    <a:prstGeom prst="rect">
+                      <a:avLst/>
+                    </a:prstGeom>
+                  </pic:spPr>
+                </pic:pic>
+              </a:graphicData>
+            </a:graphic>
+          </wp:inline>
+        </w:drawing>
+      </w:r>
+    </w:p>
+    <w:p>
+      <w:pPr>
+        <w:pStyle w:val="ListParagraph"/>
+        <w:ind w:left="360"/>
+      </w:pPr>
+      <w:r>
+        <w:drawing>
+          <wp:inline distT="0" distB="0" distL="0" distR="0" wp14:anchorId="2CDAE329" wp14:editId="1033119A">
+            <wp:extent cx="5190490" cy="3679370"/>
+            <wp:effectExtent l="0" t="0" r="0" b="0"/>
+            <wp:docPr id="533455841" name="Picture 1"/>
+            <wp:cNvGraphicFramePr>
+              <a:graphicFrameLocks xmlns:a="http://schemas.openxmlformats.org/drawingml/2006/main" noChangeAspect="1"/>
+            </wp:cNvGraphicFramePr>
+            <a:graphic xmlns:a="http://schemas.openxmlformats.org/drawingml/2006/main">
+              <a:graphicData uri="http://schemas.openxmlformats.org/drawingml/2006/picture">
+                <pic:pic xmlns:pic="http://schemas.openxmlformats.org/drawingml/2006/picture">
+                  <pic:nvPicPr>
+                    <pic:cNvPr id="533455841" name=""/>
+                    <pic:cNvPicPr/>
+                  </pic:nvPicPr>
+                  <pic:blipFill>
+                    <a:blip r:embed="rId37"/>
+                    <a:stretch>
+                      <a:fillRect/>
+                    </a:stretch>
+                  </pic:blipFill>
+                  <pic:spPr>
+                    <a:xfrm>
+                      <a:off x="0" y="0"/>
+                      <a:ext cx="5196218" cy="3683430"/>
+                    </a:xfrm>
+                    <a:prstGeom prst="rect">
+                      <a:avLst/>
+                    </a:prstGeom>
+                  </pic:spPr>
+                </pic:pic>
+              </a:graphicData>
+            </a:graphic>
+          </wp:inline>
+        </w:drawing>
+      </w:r>
+    </w:p>
+    <w:p>
+      <w:pPr>
+        <w:pStyle w:val="ListParagraph"/>
+        <w:ind w:left="360"/>
+      </w:pPr>
+    </w:p>
+    <w:p>
+      <w:pPr>
+        <w:pStyle w:val="ListParagraph"/>
+        <w:ind w:left="360"/>
+      </w:pPr>
+    </w:p>
+    <w:p>
+      <w:pPr>
+        <w:pStyle w:val="ListParagraph"/>
+        <w:ind w:left="360"/>
+      </w:pPr>
+    </w:p>
+    <w:p>
+      <w:pPr>
+        <w:pStyle w:val="ListParagraph"/>
+        <w:numPr>
+          <w:ilvl w:val="0"/>
+          <w:numId w:val="5"/>
+        </w:numPr>
+      </w:pPr>
+      <w:r>
+        <w:lastRenderedPageBreak/>
+        <w:t>Part 2 Step 7 - Configured and connected all processors using the required relationships to create the complete CSV-to-MySQL ETL workflow.</w:t>
+      </w:r>
+    </w:p>
+    <w:p>
+      <w:pPr>
+        <w:pStyle w:val="ListParagraph"/>
+        <w:ind w:left="360"/>
+      </w:pPr>
+      <w:r>
+        <w:drawing>
+          <wp:inline distT="0" distB="0" distL="0" distR="0" wp14:anchorId="0A13CFB8" wp14:editId="5B12E2C8">
+            <wp:extent cx="5671411" cy="7776376"/>
+            <wp:effectExtent l="0" t="0" r="5715" b="0"/>
+            <wp:docPr id="422821780" name="Picture 1"/>
+            <wp:cNvGraphicFramePr>
+              <a:graphicFrameLocks xmlns:a="http://schemas.openxmlformats.org/drawingml/2006/main" noChangeAspect="1"/>
+            </wp:cNvGraphicFramePr>
+            <a:graphic xmlns:a="http://schemas.openxmlformats.org/drawingml/2006/main">
+              <a:graphicData uri="http://schemas.openxmlformats.org/drawingml/2006/picture">
+                <pic:pic xmlns:pic="http://schemas.openxmlformats.org/drawingml/2006/picture">
+                  <pic:nvPicPr>
+                    <pic:cNvPr id="422821780" name=""/>
+                    <pic:cNvPicPr/>
+                  </pic:nvPicPr>
+                  <pic:blipFill>
+                    <a:blip r:embed="rId38"/>
+                    <a:stretch>
+                      <a:fillRect/>
+                    </a:stretch>
+                  </pic:blipFill>
+                  <pic:spPr>
+                    <a:xfrm>
+                      <a:off x="0" y="0"/>
+                      <a:ext cx="5678252" cy="7785756"/>
+                    </a:xfrm>
+                    <a:prstGeom prst="rect">
+                      <a:avLst/>
+                    </a:prstGeom>
+                  </pic:spPr>
+                </pic:pic>
+              </a:graphicData>
+            </a:graphic>
+          </wp:inline>
+        </w:drawing>
       </w:r>
     </w:p>
     <w:p>
@@ -1651,6 +3243,7 @@
         <w:ind w:left="360"/>
       </w:pPr>
       <w:r>
+        <w:lastRenderedPageBreak/>
         <w:t xml:space="preserve">Provide a screenshot of your </w:t>
       </w:r>
       <w:proofErr w:type="spellStart"/>
@@ -1661,6 +3254,113 @@
       <w:r>
         <w:t xml:space="preserve"> browser screen to show all five processors connected and running.</w:t>
       </w:r>
+    </w:p>
+    <w:p>
+      <w:pPr>
+        <w:pStyle w:val="ListParagraph"/>
+        <w:ind w:left="360"/>
+      </w:pPr>
+    </w:p>
+    <w:p>
+      <w:pPr>
+        <w:pStyle w:val="ListParagraph"/>
+        <w:numPr>
+          <w:ilvl w:val="0"/>
+          <w:numId w:val="5"/>
+        </w:numPr>
+      </w:pPr>
+      <w:r>
+        <w:t xml:space="preserve">Part 2 Step 8 - Started the </w:t>
+      </w:r>
+      <w:proofErr w:type="spellStart"/>
+      <w:r>
+        <w:t>GetFile</w:t>
+      </w:r>
+      <w:proofErr w:type="spellEnd"/>
+      <w:r>
+        <w:t xml:space="preserve">, </w:t>
+      </w:r>
+      <w:proofErr w:type="spellStart"/>
+      <w:r>
+        <w:t>SplitText</w:t>
+      </w:r>
+      <w:proofErr w:type="spellEnd"/>
+      <w:r>
+        <w:t xml:space="preserve">, </w:t>
+      </w:r>
+      <w:proofErr w:type="spellStart"/>
+      <w:r>
+        <w:t>ConvertRecord</w:t>
+      </w:r>
+      <w:proofErr w:type="spellEnd"/>
+      <w:r>
+        <w:t xml:space="preserve">, </w:t>
+      </w:r>
+      <w:proofErr w:type="spellStart"/>
+      <w:r>
+        <w:t>ConvertJSONToSQL</w:t>
+      </w:r>
+      <w:proofErr w:type="spellEnd"/>
+      <w:r>
+        <w:t xml:space="preserve">, and </w:t>
+      </w:r>
+      <w:proofErr w:type="spellStart"/>
+      <w:r>
+        <w:t>PutSQL</w:t>
+      </w:r>
+      <w:proofErr w:type="spellEnd"/>
+      <w:r>
+        <w:t xml:space="preserve"> processors and verified that the CSV-to-MySQL ETL pipeline was running successfully.</w:t>
+      </w:r>
+    </w:p>
+    <w:p>
+      <w:pPr>
+        <w:pStyle w:val="ListParagraph"/>
+        <w:ind w:left="360"/>
+      </w:pPr>
+      <w:r>
+        <w:drawing>
+          <wp:inline distT="0" distB="0" distL="0" distR="0" wp14:anchorId="7A5B48BD" wp14:editId="6EF5C1D7">
+            <wp:extent cx="5943600" cy="5870575"/>
+            <wp:effectExtent l="0" t="0" r="0" b="0"/>
+            <wp:docPr id="236412382" name="Picture 1"/>
+            <wp:cNvGraphicFramePr>
+              <a:graphicFrameLocks xmlns:a="http://schemas.openxmlformats.org/drawingml/2006/main" noChangeAspect="1"/>
+            </wp:cNvGraphicFramePr>
+            <a:graphic xmlns:a="http://schemas.openxmlformats.org/drawingml/2006/main">
+              <a:graphicData uri="http://schemas.openxmlformats.org/drawingml/2006/picture">
+                <pic:pic xmlns:pic="http://schemas.openxmlformats.org/drawingml/2006/picture">
+                  <pic:nvPicPr>
+                    <pic:cNvPr id="236412382" name=""/>
+                    <pic:cNvPicPr/>
+                  </pic:nvPicPr>
+                  <pic:blipFill>
+                    <a:blip r:embed="rId39"/>
+                    <a:stretch>
+                      <a:fillRect/>
+                    </a:stretch>
+                  </pic:blipFill>
+                  <pic:spPr>
+                    <a:xfrm>
+                      <a:off x="0" y="0"/>
+                      <a:ext cx="5943600" cy="5870575"/>
+                    </a:xfrm>
+                    <a:prstGeom prst="rect">
+                      <a:avLst/>
+                    </a:prstGeom>
+                  </pic:spPr>
+                </pic:pic>
+              </a:graphicData>
+            </a:graphic>
+          </wp:inline>
+        </w:drawing>
+      </w:r>
+    </w:p>
+    <w:p>
+      <w:pPr>
+        <w:pStyle w:val="ListParagraph"/>
+        <w:ind w:left="360"/>
+      </w:pPr>
     </w:p>
     <w:p>
       <w:pPr>
@@ -1681,6 +3381,309 @@
       <w:proofErr w:type="spellEnd"/>
       <w:r>
         <w:t xml:space="preserve"> database is now saturated with data.</w:t>
+      </w:r>
+    </w:p>
+    <w:p>
+      <w:pPr>
+        <w:pStyle w:val="ListParagraph"/>
+        <w:ind w:left="360"/>
+      </w:pPr>
+    </w:p>
+    <w:p>
+      <w:pPr>
+        <w:pStyle w:val="ListParagraph"/>
+        <w:ind w:left="360"/>
+      </w:pPr>
+    </w:p>
+    <w:p>
+      <w:pPr>
+        <w:pStyle w:val="ListParagraph"/>
+        <w:ind w:left="360"/>
+      </w:pPr>
+    </w:p>
+    <w:p>
+      <w:pPr>
+        <w:pStyle w:val="ListParagraph"/>
+        <w:ind w:left="360"/>
+      </w:pPr>
+    </w:p>
+    <w:p>
+      <w:pPr>
+        <w:pStyle w:val="ListParagraph"/>
+        <w:ind w:left="360"/>
+      </w:pPr>
+    </w:p>
+    <w:p>
+      <w:pPr>
+        <w:pStyle w:val="ListParagraph"/>
+        <w:numPr>
+          <w:ilvl w:val="0"/>
+          <w:numId w:val="5"/>
+        </w:numPr>
+      </w:pPr>
+      <w:proofErr w:type="spellStart"/>
+      <w:r>
+        <w:lastRenderedPageBreak/>
+        <w:t>GetFile</w:t>
+      </w:r>
+      <w:proofErr w:type="spellEnd"/>
+      <w:r>
+        <w:t xml:space="preserve"> already consumed the file</w:t>
+      </w:r>
+      <w:r>
+        <w:t xml:space="preserve">. </w:t>
+      </w:r>
+      <w:r>
+        <w:t xml:space="preserve">If movies.csv is no longer </w:t>
+      </w:r>
+      <w:proofErr w:type="gramStart"/>
+      <w:r>
+        <w:t xml:space="preserve">there, </w:t>
+      </w:r>
+      <w:r>
+        <w:t xml:space="preserve"> </w:t>
+      </w:r>
+      <w:proofErr w:type="spellStart"/>
+      <w:r>
+        <w:t>GetFile</w:t>
+      </w:r>
+      <w:proofErr w:type="spellEnd"/>
+      <w:proofErr w:type="gramEnd"/>
+      <w:r>
+        <w:t xml:space="preserve"> has consumed it.</w:t>
+      </w:r>
+    </w:p>
+    <w:p>
+      <w:pPr>
+        <w:pStyle w:val="ListParagraph"/>
+      </w:pPr>
+    </w:p>
+    <w:p>
+      <w:pPr>
+        <w:pStyle w:val="ListParagraph"/>
+        <w:ind w:left="360"/>
+      </w:pPr>
+      <w:r>
+        <w:drawing>
+          <wp:inline distT="0" distB="0" distL="0" distR="0" wp14:anchorId="194DC0A8" wp14:editId="22B22D04">
+            <wp:extent cx="5943600" cy="4333875"/>
+            <wp:effectExtent l="0" t="0" r="0" b="9525"/>
+            <wp:docPr id="449909274" name="Picture 1"/>
+            <wp:cNvGraphicFramePr>
+              <a:graphicFrameLocks xmlns:a="http://schemas.openxmlformats.org/drawingml/2006/main" noChangeAspect="1"/>
+            </wp:cNvGraphicFramePr>
+            <a:graphic xmlns:a="http://schemas.openxmlformats.org/drawingml/2006/main">
+              <a:graphicData uri="http://schemas.openxmlformats.org/drawingml/2006/picture">
+                <pic:pic xmlns:pic="http://schemas.openxmlformats.org/drawingml/2006/picture">
+                  <pic:nvPicPr>
+                    <pic:cNvPr id="449909274" name=""/>
+                    <pic:cNvPicPr/>
+                  </pic:nvPicPr>
+                  <pic:blipFill>
+                    <a:blip r:embed="rId40"/>
+                    <a:stretch>
+                      <a:fillRect/>
+                    </a:stretch>
+                  </pic:blipFill>
+                  <pic:spPr>
+                    <a:xfrm>
+                      <a:off x="0" y="0"/>
+                      <a:ext cx="5943600" cy="4333875"/>
+                    </a:xfrm>
+                    <a:prstGeom prst="rect">
+                      <a:avLst/>
+                    </a:prstGeom>
+                  </pic:spPr>
+                </pic:pic>
+              </a:graphicData>
+            </a:graphic>
+          </wp:inline>
+        </w:drawing>
+      </w:r>
+    </w:p>
+    <w:p>
+      <w:pPr>
+        <w:pStyle w:val="ListParagraph"/>
+        <w:ind w:left="360"/>
+      </w:pPr>
+    </w:p>
+    <w:p>
+      <w:pPr>
+        <w:pStyle w:val="ListParagraph"/>
+        <w:ind w:left="360"/>
+      </w:pPr>
+    </w:p>
+    <w:p>
+      <w:pPr>
+        <w:pStyle w:val="ListParagraph"/>
+        <w:ind w:left="360"/>
+      </w:pPr>
+    </w:p>
+    <w:p>
+      <w:pPr>
+        <w:pStyle w:val="ListParagraph"/>
+        <w:ind w:left="360"/>
+      </w:pPr>
+    </w:p>
+    <w:p>
+      <w:pPr>
+        <w:pStyle w:val="ListParagraph"/>
+        <w:ind w:left="360"/>
+      </w:pPr>
+    </w:p>
+    <w:p>
+      <w:pPr>
+        <w:pStyle w:val="ListParagraph"/>
+        <w:ind w:left="360"/>
+      </w:pPr>
+    </w:p>
+    <w:p>
+      <w:pPr>
+        <w:pStyle w:val="ListParagraph"/>
+        <w:ind w:left="360"/>
+      </w:pPr>
+    </w:p>
+    <w:p>
+      <w:pPr>
+        <w:pStyle w:val="ListParagraph"/>
+        <w:ind w:left="360"/>
+      </w:pPr>
+    </w:p>
+    <w:p>
+      <w:pPr>
+        <w:pStyle w:val="ListParagraph"/>
+        <w:ind w:left="360"/>
+      </w:pPr>
+    </w:p>
+    <w:p>
+      <w:pPr>
+        <w:pStyle w:val="ListParagraph"/>
+        <w:ind w:left="360"/>
+      </w:pPr>
+    </w:p>
+    <w:p>
+      <w:pPr>
+        <w:pStyle w:val="ListParagraph"/>
+        <w:ind w:left="360"/>
+      </w:pPr>
+    </w:p>
+    <w:p>
+      <w:pPr>
+        <w:pStyle w:val="ListParagraph"/>
+        <w:ind w:left="360"/>
+      </w:pPr>
+    </w:p>
+    <w:p>
+      <w:pPr>
+        <w:pStyle w:val="ListParagraph"/>
+        <w:ind w:left="360"/>
+      </w:pPr>
+    </w:p>
+    <w:p>
+      <w:pPr>
+        <w:pStyle w:val="ListParagraph"/>
+        <w:ind w:left="360"/>
+      </w:pPr>
+    </w:p>
+    <w:p>
+      <w:pPr>
+        <w:pStyle w:val="ListParagraph"/>
+        <w:ind w:left="360"/>
+      </w:pPr>
+    </w:p>
+    <w:p>
+      <w:pPr>
+        <w:pStyle w:val="ListParagraph"/>
+        <w:ind w:left="360"/>
+      </w:pPr>
+    </w:p>
+    <w:p>
+      <w:pPr>
+        <w:pStyle w:val="ListParagraph"/>
+        <w:ind w:left="360"/>
+      </w:pPr>
+    </w:p>
+    <w:p>
+      <w:pPr>
+        <w:pStyle w:val="ListParagraph"/>
+        <w:ind w:left="360"/>
+      </w:pPr>
+    </w:p>
+    <w:p>
+      <w:pPr>
+        <w:pStyle w:val="ListParagraph"/>
+        <w:ind w:left="360"/>
+      </w:pPr>
+    </w:p>
+    <w:p>
+      <w:pPr>
+        <w:pStyle w:val="ListParagraph"/>
+        <w:ind w:left="360"/>
+      </w:pPr>
+      <w:r>
+        <w:lastRenderedPageBreak/>
+        <w:t xml:space="preserve">Part 2 Step 9 - Verified that movie records from movies.csv were successfully loaded into the </w:t>
+      </w:r>
+      <w:proofErr w:type="spellStart"/>
+      <w:proofErr w:type="gramStart"/>
+      <w:r>
+        <w:t>movielens.movies</w:t>
+      </w:r>
+      <w:proofErr w:type="spellEnd"/>
+      <w:proofErr w:type="gramEnd"/>
+      <w:r>
+        <w:t xml:space="preserve"> table using the Apache </w:t>
+      </w:r>
+      <w:proofErr w:type="spellStart"/>
+      <w:r>
+        <w:t>NiFi</w:t>
+      </w:r>
+      <w:proofErr w:type="spellEnd"/>
+      <w:r>
+        <w:t xml:space="preserve"> ETL pipeline.</w:t>
+      </w:r>
+    </w:p>
+    <w:p>
+      <w:pPr>
+        <w:pStyle w:val="ListParagraph"/>
+        <w:ind w:left="360"/>
+      </w:pPr>
+      <w:r>
+        <w:drawing>
+          <wp:inline distT="0" distB="0" distL="0" distR="0" wp14:anchorId="321292B2" wp14:editId="0A2F508B">
+            <wp:extent cx="5383033" cy="5077649"/>
+            <wp:effectExtent l="0" t="0" r="8255" b="8890"/>
+            <wp:docPr id="192371172" name="Picture 1"/>
+            <wp:cNvGraphicFramePr>
+              <a:graphicFrameLocks xmlns:a="http://schemas.openxmlformats.org/drawingml/2006/main" noChangeAspect="1"/>
+            </wp:cNvGraphicFramePr>
+            <a:graphic xmlns:a="http://schemas.openxmlformats.org/drawingml/2006/main">
+              <a:graphicData uri="http://schemas.openxmlformats.org/drawingml/2006/picture">
+                <pic:pic xmlns:pic="http://schemas.openxmlformats.org/drawingml/2006/picture">
+                  <pic:nvPicPr>
+                    <pic:cNvPr id="192371172" name=""/>
+                    <pic:cNvPicPr/>
+                  </pic:nvPicPr>
+                  <pic:blipFill>
+                    <a:blip r:embed="rId41"/>
+                    <a:stretch>
+                      <a:fillRect/>
+                    </a:stretch>
+                  </pic:blipFill>
+                  <pic:spPr>
+                    <a:xfrm>
+                      <a:off x="0" y="0"/>
+                      <a:ext cx="5385698" cy="5080163"/>
+                    </a:xfrm>
+                    <a:prstGeom prst="rect">
+                      <a:avLst/>
+                    </a:prstGeom>
+                  </pic:spPr>
+                </pic:pic>
+              </a:graphicData>
+            </a:graphic>
+          </wp:inline>
+        </w:drawing>
       </w:r>
     </w:p>
     <w:sectPr>

</xml_diff>